<commit_message>
Alinea la politica de envios del Word de ejemplo con el documento de pedidos
Los dos documentos de ejemplo de la libreta se contradecian: el Word decia
envio de 35 pesos y gratis desde 300, y el documento de pedidos dice 45 con
minimo de 200. La misma pregunta recibia una respuesta u otra segun que
fragmento ganara la busqueda, y eso lo hereda cualquiera que use la plantilla.

El Word pasa a 45 de envio con minimo de 200 y a las salidas de las 11 y las 5,
que es lo que dice el documento de pedidos. Se conserva el texto sin acentos:
es a proposito, sirve para ensenar que la busqueda encuentra igual.
</commit_message>
<xml_diff>
--- a/conocimiento/politica-envios.docx
+++ b/conocimiento/politica-envios.docx
@@ -4,12 +4,12 @@
   <w:body>
     <w:p>
       <w:r>
-        <w:t>El envio a domicilio cuesta 35 pesos y es gratis en pedidos mayores a 300 pesos.</w:t>
+        <w:t>El envio a domicilio cuesta 45 pesos y el pedido minimo para envio es de 200 pesos.</w:t>
       </w:r>
     </w:p>
     <w:p>
       <w:r>
-        <w:t>Entregamos de lunes a sabado entre las 9 de la manana y las 5 de la tarde.</w:t>
+        <w:t>Salimos a repartir a las 11 de la manana y a las 5 de la tarde, de lunes a sabado.</w:t>
       </w:r>
     </w:p>
     <w:sectPr>

</xml_diff>